<commit_message>
Checkpoint news scenarios, action guidance, and lean brief packets
</commit_message>
<xml_diff>
--- a/demo/templates/neoagent-v2-campaign-plan.docx
+++ b/demo/templates/neoagent-v2-campaign-plan.docx
@@ -255,7 +255,7 @@
           <w:color w:val="1f2937"/>
           <w:rtl w:val="0"/>
         </w:rPr>
-        <w:t xml:space="preserve">The marketing shoot is blocked because the planned venue is unavailable. Priya holds Studio B Friday or Studio C Tuesday until 4:30 PM today.</w:t>
+        <w:t xml:space="preserve">Priya has checked both shoot options. Studio B Friday and Studio C Tuesday both work. She needs your preference by 4:30 PM today.</w:t>
       </w:r>
     </w:p>
     <w:p>
@@ -447,21 +447,21 @@
           <w:szCs w:val="24"/>
           <w:rtl w:val="0"/>
         </w:rPr>
-        <w:t xml:space="preserve">4. Marketing shoot date</w:t>
-      </w:r>
-    </w:p>
-    <w:p>
-      <w:pPr>
-        <w:rPr>
-          <w:color w:val="1f2937"/>
-        </w:rPr>
-      </w:pPr>
-      <w:r>
-        <w:rPr>
-          <w:color w:val="1f2937"/>
-          <w:rtl w:val="0"/>
-        </w:rPr>
-        <w:t xml:space="preserve">Choose a replacement date so Priya can rebook the venue and preserve downstream crew holds.</w:t>
+        <w:t xml:space="preserve">4. Marketing shoot preference</w:t>
+      </w:r>
+    </w:p>
+    <w:p>
+      <w:pPr>
+        <w:rPr>
+          <w:color w:val="1f2937"/>
+        </w:rPr>
+      </w:pPr>
+      <w:r>
+        <w:rPr>
+          <w:color w:val="1f2937"/>
+          <w:rtl w:val="0"/>
+        </w:rPr>
+        <w:t xml:space="preserve">Reply with your preferred option. Priya handles booking and production arrangements.</w:t>
       </w:r>
     </w:p>
     <w:p>
@@ -705,7 +705,7 @@
           <w:color w:val="1f2937"/>
           <w:rtl w:val="0"/>
         </w:rPr>
-        <w:t xml:space="preserve">Capture the marketing shoot date decision and unblock venue and crew booking.</w:t>
+        <w:t xml:space="preserve">Get the user's date preference so Priya can confirm booking and production arrangements.</w:t>
       </w:r>
     </w:p>
     <w:p>

</xml_diff>